<commit_message>
Deploy preview for PR 125 🛫
</commit_message>
<xml_diff>
--- a/pr-preview/pr-125/chapters/03-observational-studies-tracked-changes.docx
+++ b/pr-preview/pr-125/chapters/03-observational-studies-tracked-changes.docx
@@ -5164,7 +5164,7 @@
                 <w:b/>
                 <w:bCs/>
               </w:rPr>
-              <w:t xml:space="preserve">Definition 4 (Identifiability)</w:t>
+              <w:t xml:space="preserve">Definition 4 (Identifiability of an average causal effect)</w:t>
             </w:r>
             <w:r>
               <w:t xml:space="preserve"> </w:t>
@@ -8051,7 +8051,43 @@
               <w:t xml:space="preserve"> </w:t>
             </w:r>
             <w:r>
-              <w:t xml:space="preserve">The study in</w:t>
+              <w:t xml:space="preserve">Suppose</w:t>
+            </w:r>
+            <w:r>
+              <w:t xml:space="preserve"> </w:t>
+            </w:r>
+            <m:oMath>
+              <m:r>
+                <m:t>L</m:t>
+              </m:r>
+            </m:oMath>
+            <w:r>
+              <w:t xml:space="preserve"> </w:t>
+            </w:r>
+            <w:r>
+              <w:t xml:space="preserve">is the</w:t>
+            </w:r>
+            <w:r>
+              <w:t xml:space="preserve"> </w:t>
+            </w:r>
+            <w:r>
+              <w:rPr>
+                <w:b/>
+                <w:bCs/>
+              </w:rPr>
+              <w:t xml:space="preserve">only</w:t>
+            </w:r>
+            <w:r>
+              <w:t xml:space="preserve"> </w:t>
+            </w:r>
+            <w:r>
+              <w:t xml:space="preserve">outcome predictor unequally distributed between treatment groups.</w:t>
+            </w:r>
+            <w:r>
+              <w:t xml:space="preserve"> </w:t>
+            </w:r>
+            <w:r>
+              <w:t xml:space="preserve">Then the study in</w:t>
             </w:r>
             <w:r>
               <w:t xml:space="preserve"> </w:t>
@@ -8341,37 +8377,7 @@
               <w:pStyle w:val="FirstParagraph"/>
             </w:pPr>
             <w:r>
-              <w:t xml:space="preserve">Under either description, if</w:t>
-            </w:r>
-            <w:r>
-              <w:t xml:space="preserve"> </w:t>
-            </w:r>
-            <m:oMath>
-              <m:r>
-                <m:t>L</m:t>
-              </m:r>
-            </m:oMath>
-            <w:r>
-              <w:t xml:space="preserve"> </w:t>
-            </w:r>
-            <w:r>
-              <w:t xml:space="preserve">is the</w:t>
-            </w:r>
-            <w:r>
-              <w:t xml:space="preserve"> </w:t>
-            </w:r>
-            <w:r>
-              <w:rPr>
-                <w:b/>
-                <w:bCs/>
-              </w:rPr>
-              <w:t xml:space="preserve">only</w:t>
-            </w:r>
-            <w:r>
-              <w:t xml:space="preserve"> </w:t>
-            </w:r>
-            <w:r>
-              <w:t xml:space="preserve">outcome predictor unequally distributed between treatment groups, then</w:t>
+              <w:t xml:space="preserve">Under either description,</w:t>
             </w:r>
             <w:r>
               <w:t xml:space="preserve"> </w:t>
@@ -9069,7 +9075,35 @@
               <w:t xml:space="preserve"> (Conditional exchangeability cannot be verified). </w:t>
             </w:r>
             <w:r>
-              <w:t xml:space="preserve">Conditional exchangeability</w:t>
+              <w:t xml:space="preserve">Let</w:t>
+            </w:r>
+            <w:r>
+              <w:t xml:space="preserve"> </w:t>
+            </w:r>
+            <m:oMath>
+              <m:r>
+                <m:t>A</m:t>
+              </m:r>
+            </m:oMath>
+            <w:r>
+              <w:t xml:space="preserve"> </w:t>
+            </w:r>
+            <w:r>
+              <w:t xml:space="preserve">be a treatment,</w:t>
+            </w:r>
+            <w:r>
+              <w:t xml:space="preserve"> </w:t>
+            </w:r>
+            <m:oMath>
+              <m:r>
+                <m:t>Y</m:t>
+              </m:r>
+            </m:oMath>
+            <w:r>
+              <w:t xml:space="preserve"> </w:t>
+            </w:r>
+            <w:r>
+              <w:t xml:space="preserve">a dichotomous outcome with counterfactual outcomes</w:t>
             </w:r>
             <w:r>
               <w:t xml:space="preserve"> </w:t>
@@ -9087,36 +9121,14 @@
                   </m:r>
                 </m:sup>
               </m:sSup>
-              <m:r>
-                <m:rPr>
-                  <m:sty m:val="p"/>
-                </m:rPr>
-                <m:t>⟂</m:t>
-              </m:r>
-              <m:r>
-                <m:t>​</m:t>
-              </m:r>
-              <m:r>
-                <m:t>​</m:t>
-              </m:r>
-              <m:r>
-                <m:t>​</m:t>
-              </m:r>
-              <m:r>
-                <m:rPr>
-                  <m:sty m:val="p"/>
-                </m:rPr>
-                <m:t>⟂</m:t>
-              </m:r>
-              <m:r>
-                <m:t>A</m:t>
-              </m:r>
-              <m:r>
-                <m:rPr>
-                  <m:sty m:val="p"/>
-                </m:rPr>
-                <m:t>∣</m:t>
-              </m:r>
+            </m:oMath>
+            <w:r>
+              <w:t xml:space="preserve">,</w:t>
+            </w:r>
+            <w:r>
+              <w:t xml:space="preserve"> </w:t>
+            </w:r>
+            <m:oMath>
               <m:r>
                 <m:t>L</m:t>
               </m:r>
@@ -9125,7 +9137,7 @@
               <w:t xml:space="preserve"> </w:t>
             </w:r>
             <w:r>
-              <w:t xml:space="preserve">generally fails when some unmeasured variable</w:t>
+              <w:t xml:space="preserve">the measured covariates, and</w:t>
             </w:r>
             <w:r>
               <w:t xml:space="preserve"> </w:t>
@@ -9139,41 +9151,18 @@
               <w:t xml:space="preserve"> </w:t>
             </w:r>
             <w:r>
-              <w:t xml:space="preserve">both independently predicts the outcome and, within strata of</w:t>
-            </w:r>
-            <w:r>
-              <w:t xml:space="preserve"> </w:t>
-            </w:r>
-            <m:oMath>
-              <m:r>
-                <m:t>L</m:t>
-              </m:r>
-            </m:oMath>
-            <w:r>
-              <w:t xml:space="preserve">, changes the chance of being treated.</w:t>
-            </w:r>
-            <w:r>
-              <w:t xml:space="preserve"> </w:t>
-            </w:r>
-            <w:r>
-              <w:t xml:space="preserve">Even when it holds, it cannot be checked: verifying it would require comparing</w:t>
-            </w:r>
-            <w:r>
-              <w:t xml:space="preserve"> </w:t>
-            </w:r>
-            <m:oMath>
-              <m:r>
-                <m:rPr>
-                  <m:sty m:val="p"/>
-                </m:rPr>
-                <m:t>Pr</m:t>
-              </m:r>
-              <m:r>
-                <m:rPr>
-                  <m:sty m:val="p"/>
-                </m:rPr>
-                <m:t>[</m:t>
-              </m:r>
+              <w:t xml:space="preserve">an unmeasured variable.</w:t>
+            </w:r>
+            <w:r>
+              <w:t xml:space="preserve"> </w:t>
+            </w:r>
+            <w:r>
+              <w:t xml:space="preserve">Conditional exchangeability</w:t>
+            </w:r>
+            <w:r>
+              <w:t xml:space="preserve"> </w:t>
+            </w:r>
+            <m:oMath>
               <m:sSup>
                 <m:e>
                   <m:r>
@@ -9190,10 +9179,25 @@
                 <m:rPr>
                   <m:sty m:val="p"/>
                 </m:rPr>
-                <m:t>=</m:t>
-              </m:r>
-              <m:r>
-                <m:t>1</m:t>
+                <m:t>⟂</m:t>
+              </m:r>
+              <m:r>
+                <m:t>​</m:t>
+              </m:r>
+              <m:r>
+                <m:t>​</m:t>
+              </m:r>
+              <m:r>
+                <m:t>​</m:t>
+              </m:r>
+              <m:r>
+                <m:rPr>
+                  <m:sty m:val="p"/>
+                </m:rPr>
+                <m:t>⟂</m:t>
+              </m:r>
+              <m:r>
+                <m:t>A</m:t>
               </m:r>
               <m:r>
                 <m:rPr>
@@ -9202,47 +9206,45 @@
                 <m:t>∣</m:t>
               </m:r>
               <m:r>
-                <m:t>A</m:t>
-              </m:r>
-              <m:r>
-                <m:rPr>
-                  <m:sty m:val="p"/>
-                </m:rPr>
-                <m:t>=</m:t>
-              </m:r>
-              <m:r>
-                <m:t>a</m:t>
-              </m:r>
-              <m:r>
-                <m:rPr>
-                  <m:sty m:val="p"/>
-                </m:rPr>
-                <m:t>,</m:t>
-              </m:r>
-              <m:r>
                 <m:t>L</m:t>
               </m:r>
-              <m:r>
-                <m:rPr>
-                  <m:sty m:val="p"/>
-                </m:rPr>
-                <m:t>=</m:t>
-              </m:r>
-              <m:r>
-                <m:t>l</m:t>
-              </m:r>
-              <m:r>
-                <m:rPr>
-                  <m:sty m:val="p"/>
-                </m:rPr>
-                <m:t>]</m:t>
-              </m:r>
-            </m:oMath>
-            <w:r>
-              <w:t xml:space="preserve"> </w:t>
-            </w:r>
-            <w:r>
-              <w:t xml:space="preserve">with</w:t>
+            </m:oMath>
+            <w:r>
+              <w:t xml:space="preserve"> </w:t>
+            </w:r>
+            <w:r>
+              <w:t xml:space="preserve">generally fails when some unmeasured variable</w:t>
+            </w:r>
+            <w:r>
+              <w:t xml:space="preserve"> </w:t>
+            </w:r>
+            <m:oMath>
+              <m:r>
+                <m:t>U</m:t>
+              </m:r>
+            </m:oMath>
+            <w:r>
+              <w:t xml:space="preserve"> </w:t>
+            </w:r>
+            <w:r>
+              <w:t xml:space="preserve">both independently predicts the outcome and, within strata of</w:t>
+            </w:r>
+            <w:r>
+              <w:t xml:space="preserve"> </w:t>
+            </w:r>
+            <m:oMath>
+              <m:r>
+                <m:t>L</m:t>
+              </m:r>
+            </m:oMath>
+            <w:r>
+              <w:t xml:space="preserve">, changes the chance of being treated.</w:t>
+            </w:r>
+            <w:r>
+              <w:t xml:space="preserve"> </w:t>
+            </w:r>
+            <w:r>
+              <w:t xml:space="preserve">Even when it holds, it cannot be checked: verifying it would require comparing</w:t>
             </w:r>
             <w:r>
               <w:t xml:space="preserve"> </w:t>
@@ -9294,6 +9296,92 @@
                 <m:rPr>
                   <m:sty m:val="p"/>
                 </m:rPr>
+                <m:t>=</m:t>
+              </m:r>
+              <m:r>
+                <m:t>a</m:t>
+              </m:r>
+              <m:r>
+                <m:rPr>
+                  <m:sty m:val="p"/>
+                </m:rPr>
+                <m:t>,</m:t>
+              </m:r>
+              <m:r>
+                <m:t>L</m:t>
+              </m:r>
+              <m:r>
+                <m:rPr>
+                  <m:sty m:val="p"/>
+                </m:rPr>
+                <m:t>=</m:t>
+              </m:r>
+              <m:r>
+                <m:t>l</m:t>
+              </m:r>
+              <m:r>
+                <m:rPr>
+                  <m:sty m:val="p"/>
+                </m:rPr>
+                <m:t>]</m:t>
+              </m:r>
+            </m:oMath>
+            <w:r>
+              <w:t xml:space="preserve"> </w:t>
+            </w:r>
+            <w:r>
+              <w:t xml:space="preserve">with</w:t>
+            </w:r>
+            <w:r>
+              <w:t xml:space="preserve"> </w:t>
+            </w:r>
+            <m:oMath>
+              <m:r>
+                <m:rPr>
+                  <m:sty m:val="p"/>
+                </m:rPr>
+                <m:t>Pr</m:t>
+              </m:r>
+              <m:r>
+                <m:rPr>
+                  <m:sty m:val="p"/>
+                </m:rPr>
+                <m:t>[</m:t>
+              </m:r>
+              <m:sSup>
+                <m:e>
+                  <m:r>
+                    <m:t>Y</m:t>
+                  </m:r>
+                </m:e>
+                <m:sup>
+                  <m:r>
+                    <m:t>a</m:t>
+                  </m:r>
+                </m:sup>
+              </m:sSup>
+              <m:r>
+                <m:rPr>
+                  <m:sty m:val="p"/>
+                </m:rPr>
+                <m:t>=</m:t>
+              </m:r>
+              <m:r>
+                <m:t>1</m:t>
+              </m:r>
+              <m:r>
+                <m:rPr>
+                  <m:sty m:val="p"/>
+                </m:rPr>
+                <m:t>∣</m:t>
+              </m:r>
+              <m:r>
+                <m:t>A</m:t>
+              </m:r>
+              <m:r>
+                <m:rPr>
+                  <m:sty m:val="p"/>
+                </m:rPr>
                 <m:t>≠</m:t>
               </m:r>
               <m:r>
@@ -9325,7 +9413,30 @@
               </m:r>
             </m:oMath>
             <w:r>
-              <w:t xml:space="preserve">, but</w:t>
+              <w:t xml:space="preserve"> </w:t>
+            </w:r>
+            <w:r>
+              <w:t xml:space="preserve">at each</w:t>
+            </w:r>
+            <w:r>
+              <w:t xml:space="preserve"> </w:t>
+            </w:r>
+            <m:oMath>
+              <m:r>
+                <m:t>l</m:t>
+              </m:r>
+            </m:oMath>
+            <w:r>
+              <w:t xml:space="preserve"> </w:t>
+            </w:r>
+            <w:r>
+              <w:t xml:space="preserve">where both groups exist,</w:t>
+            </w:r>
+            <w:r>
+              <w:t xml:space="preserve"> </w:t>
+            </w:r>
+            <w:r>
+              <w:t xml:space="preserve">but</w:t>
             </w:r>
             <w:r>
               <w:t xml:space="preserve"> </w:t>
@@ -9494,25 +9605,19 @@
               <w:spacing w:before="16" w:after="16"/>
             </w:pPr>
             <w:r>
-              <w:t xml:space="preserve">Investigators cannot test conditional exchangeability, but they can make it more plausible.</w:t>
-            </w:r>
-            <w:r>
-              <w:t xml:space="preserve"> </w:t>
-            </w:r>
-            <w:r>
-              <w:t xml:space="preserve">Rather than a single covariate, they can measure many relevant variables</w:t>
-            </w:r>
-            <w:r>
-              <w:t xml:space="preserve"> </w:t>
-            </w:r>
-            <w:r>
-              <w:t xml:space="preserve">(for example, determinants of treatment that also independently predict the outcome),</w:t>
-            </w:r>
-            <w:r>
-              <w:t xml:space="preserve"> </w:t>
-            </w:r>
-            <w:r>
-              <w:t xml:space="preserve">and then assume exchangeability within the strata those variables define.</w:t>
+              <w:t xml:space="preserve">Conditional exchangeability cannot be tested,</w:t>
+            </w:r>
+            <w:r>
+              <w:t xml:space="preserve"> </w:t>
+            </w:r>
+            <w:r>
+              <w:t xml:space="preserve">so investigators make it more plausible by using expert knowledge to choose and measure many relevant covariates,</w:t>
+            </w:r>
+            <w:r>
+              <w:t xml:space="preserve"> </w:t>
+            </w:r>
+            <w:r>
+              <w:t xml:space="preserve">and then assuming exchangeability within their joint strata.</w:t>
             </w:r>
           </w:p>
           <w:p/>
@@ -13799,6 +13904,40 @@
               <w:t xml:space="preserve"> (Positivity can sometimes be checked). </w:t>
             </w:r>
             <w:r>
+              <w:t xml:space="preserve">Let</w:t>
+            </w:r>
+            <w:r>
+              <w:t xml:space="preserve"> </w:t>
+            </w:r>
+            <m:oMath>
+              <m:r>
+                <m:t>A</m:t>
+              </m:r>
+            </m:oMath>
+            <w:r>
+              <w:t xml:space="preserve"> </w:t>
+            </w:r>
+            <w:r>
+              <w:t xml:space="preserve">be a treatment and</w:t>
+            </w:r>
+            <w:r>
+              <w:t xml:space="preserve"> </w:t>
+            </w:r>
+            <m:oMath>
+              <m:r>
+                <m:t>L</m:t>
+              </m:r>
+            </m:oMath>
+            <w:r>
+              <w:t xml:space="preserve"> </w:t>
+            </w:r>
+            <w:r>
+              <w:t xml:space="preserve">the covariates required for exchangeability.</w:t>
+            </w:r>
+            <w:r>
+              <w:t xml:space="preserve"> </w:t>
+            </w:r>
+            <w:r>
               <w:t xml:space="preserve">Unlike exchangeability, positivity can sometimes be</w:t>
             </w:r>
             <w:r>
@@ -13815,13 +13954,44 @@
               <w:t xml:space="preserve"> </w:t>
             </w:r>
             <w:r>
-              <w:t xml:space="preserve">(Chapter 12).</w:t>
-            </w:r>
-            <w:r>
-              <w:t xml:space="preserve"> </w:t>
-            </w:r>
-            <w:r>
-              <w:t xml:space="preserve">In</w:t>
+              <w:t xml:space="preserve">(Chapter 12):</w:t>
+            </w:r>
+            <w:r>
+              <w:t xml:space="preserve"> </w:t>
+            </w:r>
+            <w:r>
+              <w:t xml:space="preserve">when</w:t>
+            </w:r>
+            <w:r>
+              <w:t xml:space="preserve"> </w:t>
+            </w:r>
+            <m:oMath>
+              <m:r>
+                <m:t>L</m:t>
+              </m:r>
+            </m:oMath>
+            <w:r>
+              <w:t xml:space="preserve"> </w:t>
+            </w:r>
+            <w:r>
+              <w:t xml:space="preserve">has few levels, the data can show that every treatment value occurs at every level of</w:t>
+            </w:r>
+            <w:r>
+              <w:t xml:space="preserve"> </w:t>
+            </w:r>
+            <m:oMath>
+              <m:r>
+                <m:t>L</m:t>
+              </m:r>
+            </m:oMath>
+            <w:r>
+              <w:t xml:space="preserve">.</w:t>
+            </w:r>
+            <w:r>
+              <w:t xml:space="preserve"> </w:t>
+            </w:r>
+            <w:r>
+              <w:t xml:space="preserve">That is how it was checked in</w:t>
             </w:r>
             <w:r>
               <w:t xml:space="preserve"> </w:t>
@@ -13835,10 +14005,7 @@
               </w:r>
             </w:hyperlink>
             <w:r>
-              <w:t xml:space="preserve"> </w:t>
-            </w:r>
-            <w:r>
-              <w:t xml:space="preserve">there are treated and untreated individuals in both levels of</w:t>
+              <w:t xml:space="preserve">, where both levels of</w:t>
             </w:r>
             <w:r>
               <w:t xml:space="preserve"> </w:t>
@@ -13852,7 +14019,7 @@
               <w:t xml:space="preserve"> </w:t>
             </w:r>
             <w:r>
-              <w:t xml:space="preserve">(</w:t>
+              <w:t xml:space="preserve">contain treated and untreated individuals (</w:t>
             </w:r>
             <w:hyperlink w:anchor="exm-table-3-1-positivity">
               <w:r>
@@ -23140,7 +23307,7 @@
                 <w:b/>
                 <w:bCs/>
               </w:rPr>
-              <w:t xml:space="preserve">Definition 12 (Non-intervention variable)</w:t>
+              <w:t xml:space="preserve">Definition 12 (Variables that are not interventions)</w:t>
             </w:r>
             <w:r>
               <w:t xml:space="preserve"> </w:t>
@@ -23283,7 +23450,7 @@
               <w:t xml:space="preserve"> </w:t>
             </w:r>
             <w:r>
-              <w:t xml:space="preserve">Biological states (blood pressure, LDL cholesterol, body weight) and social factors (socioeconomic status) are non-intervention variables (</w:t>
+              <w:t xml:space="preserve">Body weight, blood pressure and cholesterol, and social factors such as socioeconomic status, are non-intervention variables (</w:t>
             </w:r>
             <w:hyperlink w:anchor="def-non-intervention-variable">
               <w:r>
@@ -31294,7 +31461,7 @@
               <w:t xml:space="preserve">Remark 15</w:t>
             </w:r>
             <w:r>
-              <w:t xml:space="preserve"> (What a valid emulation needs). </w:t>
+              <w:t xml:space="preserve"> (Requirements for a valid emulation). </w:t>
             </w:r>
             <w:r>
               <w:t xml:space="preserve">Once the protocol of a target trial (</w:t>

</xml_diff>